<commit_message>
docs(governance): reestructurar manual de agentes, actualizar ERS a bcrypt y crear roadmap local
</commit_message>
<xml_diff>
--- a/docs/Especificación de Requisitos de Software (IEEE 830) - Heladería V2.docx
+++ b/docs/Especificación de Requisitos de Software (IEEE 830) - Heladería V2.docx
@@ -7362,14 +7362,7 @@
         <w:ind w:left="600" w:hanging="360"/>
       </w:pPr>
       <w:r>
-        <w:rPr>
-          <w:rFonts w:ascii="Arial" w:cs="Arial" w:eastAsia="Arial" w:hAnsi="Arial"/>
-          <w:color w:val="222222"/>
-          <w:sz w:val="18"/>
-          <w:szCs w:val="18"/>
-          <w:rtl w:val="0"/>
-        </w:rPr>
-        <w:t xml:space="preserve">Documentación Oficial de Python Software Foundation (Python 3.10+ Standard Library: `sqlite3`, `hashlib`, `datetime`).</w:t>
+        <w:t>Documentación Oficial de Python Software Foundation (Python 3.10+ Standard Library: sqlite3, datetime; Biblioteca de Hashing Criptográfico: bcrypt; Framework GUI: CustomTkinter).</w:t>
       </w:r>
     </w:p>
     <w:p>
@@ -10428,26 +10421,7 @@
         <w:ind w:left="600" w:hanging="360"/>
       </w:pPr>
       <w:r>
-        <w:rPr>
-          <w:rFonts w:ascii="Arial" w:cs="Arial" w:eastAsia="Arial" w:hAnsi="Arial"/>
-          <w:b w:val="1"/>
-          <w:bCs w:val="1"/>
-          <w:color w:val="222222"/>
-          <w:sz w:val="18"/>
-          <w:szCs w:val="18"/>
-          <w:rtl w:val="0"/>
-        </w:rPr>
-        <w:t xml:space="preserve">Entorno de Ejecución:</w:t>
-      </w:r>
-      <w:r>
-        <w:rPr>
-          <w:rFonts w:ascii="Arial" w:cs="Arial" w:eastAsia="Arial" w:hAnsi="Arial"/>
-          <w:color w:val="222222"/>
-          <w:sz w:val="18"/>
-          <w:szCs w:val="18"/>
-          <w:rtl w:val="0"/>
-        </w:rPr>
-        <w:t xml:space="preserve"> Python 3.10 o superior empaquetado en binario independiente mediante PyInstaller o cx_Freeze para ejecución con doble clic.</w:t>
+        <w:t>Entorno de Ejecución y Bibliotecas: Python 3.10 o superior, CustomTkinter (interfaz visual moderna y modular), bcrypt (hashing robusto de credenciales con salt) y sqlite3 nativo. Empaquetado para despliegue local mediante script directo o ejecutable autocontenido.</w:t>
       </w:r>
     </w:p>
     <w:p>
@@ -22395,30 +22369,8 @@
             <w:vAlign w:val="top"/>
           </w:tcPr>
           <w:p>
-            <w:pPr>
-              <w:pBdr>
-                <w:top w:space="0" w:sz="0" w:val="nil"/>
-                <w:left w:space="0" w:sz="0" w:val="nil"/>
-                <w:bottom w:space="0" w:sz="0" w:val="nil"/>
-                <w:right w:space="0" w:sz="0" w:val="nil"/>
-                <w:between w:space="0" w:sz="0" w:val="nil"/>
-              </w:pBdr>
-              <w:shd w:fill="auto" w:val="clear"/>
-              <w:spacing w:after="120" w:before="120" w:lineRule="auto"/>
-              <w:rPr>
-                <w:rFonts w:ascii="Arial" w:cs="Arial" w:eastAsia="Arial" w:hAnsi="Arial"/>
-                <w:sz w:val="18"/>
-                <w:szCs w:val="18"/>
-              </w:rPr>
-            </w:pPr>
-            <w:r>
-              <w:rPr>
-                <w:rFonts w:ascii="Arial" w:cs="Arial" w:eastAsia="Arial" w:hAnsi="Arial"/>
-                <w:sz w:val="18"/>
-                <w:szCs w:val="18"/>
-                <w:rtl w:val="0"/>
-              </w:rPr>
-              <w:t xml:space="preserve">Las contraseñas de los usuarios no se guardarán en texto plano, sino mediante funciones hash seguras (SHA-256). La base de datos SQLite garantizará transacciones atómicas (ACID), previniendo que una venta quede a medio asentar si el computador se apaga abruptamente.</w:t>
+            <w:r>
+              <w:t>Las contraseñas de los usuarios no se guardarán en texto plano, sino mediante funciones hash seguras (bcrypt) con salt dinámico y longitud fija canónica de 60 caracteres. La base de datos SQLite garantizará transacciones atómicas (ACID), previniendo que una venta quede a medio asentar si el computador se apaga abruptamente.</w:t>
             </w:r>
           </w:p>
         </w:tc>
@@ -24216,30 +24168,8 @@
             <w:vAlign w:val="top"/>
           </w:tcPr>
           <w:p>
-            <w:pPr>
-              <w:pBdr>
-                <w:top w:space="0" w:sz="0" w:val="nil"/>
-                <w:left w:space="0" w:sz="0" w:val="nil"/>
-                <w:bottom w:space="0" w:sz="0" w:val="nil"/>
-                <w:right w:space="0" w:sz="0" w:val="nil"/>
-                <w:between w:space="0" w:sz="0" w:val="nil"/>
-              </w:pBdr>
-              <w:shd w:fill="auto" w:val="clear"/>
-              <w:spacing w:after="120" w:before="120" w:lineRule="auto"/>
-              <w:rPr>
-                <w:rFonts w:ascii="Arial" w:cs="Arial" w:eastAsia="Arial" w:hAnsi="Arial"/>
-                <w:sz w:val="18"/>
-                <w:szCs w:val="18"/>
-              </w:rPr>
-            </w:pPr>
-            <w:r>
-              <w:rPr>
-                <w:rFonts w:ascii="Arial" w:cs="Arial" w:eastAsia="Arial" w:hAnsi="Arial"/>
-                <w:sz w:val="18"/>
-                <w:szCs w:val="18"/>
-                <w:rtl w:val="0"/>
-              </w:rPr>
-              <w:t xml:space="preserve">El código en Python estará desacoplado aplicando el modelo por capas: vistas (`views`), controladores (`controllers`) y modelos de persistencia (`models`), facilitando la depuración y futuras ampliaciones de módulos por parte de los estudiantes.</w:t>
+            <w:r>
+              <w:t>El software implementa una Arquitectura en Capas estricta desacoplada bajo principios SOLID y POO: Interfaz Gráfica con CustomTkinter (src/ui/), Capa de Servicios y Casos de Uso (src/services/), Capa de Repositorios y Acceso a Datos (src/repositories/), y Persistencia Relacional SQLite3 (database/ y data/). Cada capa mantiene responsabilidades aisladas, prohibiendo SQL en la UI y centralizando las transacciones ACID en repositorios.</w:t>
             </w:r>
           </w:p>
         </w:tc>
@@ -26943,6 +26873,81 @@
                 <w:rtl w:val="0"/>
               </w:rPr>
               <w:t xml:space="preserve">Bitácora cronológica inviolable de operaciones clave del sistema.</w:t>
+            </w:r>
+          </w:p>
+        </w:tc>
+      </w:tr>
+      <w:tr>
+        <w:trPr>
+          <w:cantSplit w:val="0"/>
+          <w:tblHeader w:val="0"/>
+        </w:trPr>
+        <w:tc>
+          <w:tcPr>
+            <w:tcBorders>
+              <w:top w:color="cccccc" w:space="0" w:sz="6" w:val="single"/>
+              <w:left w:color="cccccc" w:space="0" w:sz="6" w:val="single"/>
+              <w:bottom w:color="cccccc" w:space="0" w:sz="6" w:val="single"/>
+              <w:right w:color="cccccc" w:space="0" w:sz="6" w:val="single"/>
+            </w:tcBorders>
+            <w:shd w:fill="ffffff" w:val="clear"/>
+            <w:tcMar>
+              <w:top w:w="120.0" w:type="dxa"/>
+              <w:left w:w="120.0" w:type="dxa"/>
+              <w:bottom w:w="120.0" w:type="dxa"/>
+              <w:right w:w="120.0" w:type="dxa"/>
+            </w:tcMar>
+            <w:vAlign w:val="top"/>
+          </w:tcPr>
+          <w:p>
+            <w:r>
+              <w:t>Receta</w:t>
+            </w:r>
+          </w:p>
+        </w:tc>
+        <w:tc>
+          <w:tcPr>
+            <w:tcBorders>
+              <w:top w:color="cccccc" w:space="0" w:sz="6" w:val="single"/>
+              <w:left w:color="cccccc" w:space="0" w:sz="6" w:val="single"/>
+              <w:bottom w:color="cccccc" w:space="0" w:sz="6" w:val="single"/>
+              <w:right w:color="cccccc" w:space="0" w:sz="6" w:val="single"/>
+            </w:tcBorders>
+            <w:shd w:fill="ffffff" w:val="clear"/>
+            <w:tcMar>
+              <w:top w:w="120.0" w:type="dxa"/>
+              <w:left w:w="120.0" w:type="dxa"/>
+              <w:bottom w:w="120.0" w:type="dxa"/>
+              <w:right w:w="120.0" w:type="dxa"/>
+            </w:tcMar>
+            <w:vAlign w:val="top"/>
+          </w:tcPr>
+          <w:p>
+            <w:r>
+              <w:t>id_receta, id_producto, id_insumo, cantidad_necesaria</w:t>
+            </w:r>
+          </w:p>
+        </w:tc>
+        <w:tc>
+          <w:tcPr>
+            <w:tcBorders>
+              <w:top w:color="cccccc" w:space="0" w:sz="6" w:val="single"/>
+              <w:left w:color="cccccc" w:space="0" w:sz="6" w:val="single"/>
+              <w:bottom w:color="cccccc" w:space="0" w:sz="6" w:val="single"/>
+              <w:right w:color="cccccc" w:space="0" w:sz="6" w:val="single"/>
+            </w:tcBorders>
+            <w:shd w:fill="ffffff" w:val="clear"/>
+            <w:tcMar>
+              <w:top w:w="120.0" w:type="dxa"/>
+              <w:left w:w="120.0" w:type="dxa"/>
+              <w:bottom w:w="120.0" w:type="dxa"/>
+              <w:right w:w="120.0" w:type="dxa"/>
+            </w:tcMar>
+            <w:vAlign w:val="top"/>
+          </w:tcPr>
+          <w:p>
+            <w:r>
+              <w:t>Matriz de composición que vincula cada producto con sus insumos y porciones exactas para el descuento automático en ventas.</w:t>
             </w:r>
           </w:p>
         </w:tc>

</xml_diff>